<commit_message>
Fix architecture diagram title overlap; add authors (Avi Dhandhania 25BCE1207, Shivesh Kumar 25BCE1067)
</commit_message>
<xml_diff>
--- a/docs/DA1_Report.docx
+++ b/docs/DA1_Report.docx
@@ -38,6 +38,45 @@
           <w:sz w:val="24"/>
         </w:rPr>
         <w:t>SDG 13 — Climate Action  |  Supporting SDG 7 &amp; SDG 12</w:t>
+      </w:r>
+    </w:p>
+    <w:p/>
+    <w:p>
+      <w:pPr>
+        <w:jc w:val="center"/>
+      </w:pPr>
+      <w:r>
+        <w:rPr>
+          <w:i/>
+          <w:sz w:val="24"/>
+        </w:rPr>
+        <w:t>Submitted by</w:t>
+      </w:r>
+    </w:p>
+    <w:p>
+      <w:pPr>
+        <w:jc w:val="center"/>
+      </w:pPr>
+      <w:r>
+        <w:rPr>
+          <w:b/>
+          <w:color w:val="1F3A5F"/>
+          <w:sz w:val="28"/>
+        </w:rPr>
+        <w:t>Avi Dhandhania — 25BCE1207</w:t>
+      </w:r>
+    </w:p>
+    <w:p>
+      <w:pPr>
+        <w:jc w:val="center"/>
+      </w:pPr>
+      <w:r>
+        <w:rPr>
+          <w:b/>
+          <w:color w:val="1F3A5F"/>
+          <w:sz w:val="28"/>
+        </w:rPr>
+        <w:t>Shivesh Kumar — 25BCE1067</w:t>
       </w:r>
     </w:p>
     <w:p/>
@@ -1214,7 +1253,7 @@
       <w:r>
         <w:drawing>
           <wp:inline xmlns:a="http://schemas.openxmlformats.org/drawingml/2006/main" xmlns:pic="http://schemas.openxmlformats.org/drawingml/2006/picture">
-            <wp:extent cx="5760720" cy="3946181"/>
+            <wp:extent cx="5760720" cy="4197222"/>
             <wp:docPr id="1" name="Picture 1"/>
             <wp:cNvGraphicFramePr>
               <a:graphicFrameLocks noChangeAspect="1"/>
@@ -1235,7 +1274,7 @@
                   <pic:spPr>
                     <a:xfrm>
                       <a:off x="0" y="0"/>
-                      <a:ext cx="5760720" cy="3946181"/>
+                      <a:ext cx="5760720" cy="4197222"/>
                     </a:xfrm>
                     <a:prstGeom prst="rect"/>
                   </pic:spPr>

</xml_diff>